<commit_message>
Replace manuscript drafting instructions with direct paper prose
</commit_message>
<xml_diff>
--- a/papers/agentic-fea-framework/SCI_manuscript_framework.docx
+++ b/papers/agentic-fea-framework/SCI_manuscript_framework.docx
@@ -10,60 +10,18 @@
         <w:t>Skill-guided agentic finite element analysis for nonlinear static verification of bridge catwalks</w:t>
       </w:r>
     </w:p>
-    <w:p>
-      <w:r>
-        <w:t>SCI manuscript framework | Adapted section and figure structure from FeaGPT | English draft outline</w:t>
-      </w:r>
-    </w:p>
+    <w:p/>
     <w:p>
       <w:pPr>
         <w:pStyle w:val="Heading1"/>
       </w:pPr>
       <w:r>
-        <w:t>Reference structure</w:t>
+        <w:t>Abstract</w:t>
       </w:r>
     </w:p>
     <w:p>
       <w:r>
-        <w:t>Qi, Y., Xu, R., and Chu, X. FeaGPT: an End-to-End agentic-AI for Finite Element Analysis. arXiv:2510.21993v1 (2025). https://arxiv.org/abs/2510.21993v1</w:t>
-      </w:r>
-    </w:p>
-    <w:p>
-      <w:r>
-        <w:t>Working title and outline follow the reference paper’s end-to-end workflow, method modules, staged experiments and industrial demonstration. Engineering content is supplied by the catwalk Skill and the recorded six-case calculation.</w:t>
-      </w:r>
-    </w:p>
-    <w:p>
-      <w:pPr>
-        <w:pStyle w:val="Heading1"/>
-      </w:pPr>
-      <w:r>
-        <w:t>Abstract: sentence plan</w:t>
-      </w:r>
-    </w:p>
-    <w:p>
-      <w:r>
-        <w:t>Context: automated verification of prestressed catwalk cable systems requires coordinated handling of model assets, load history, solver execution and engineering reports.</w:t>
-      </w:r>
-    </w:p>
-    <w:p>
-      <w:r>
-        <w:t>Method: introduce the English Skill, versioned inputs, identity-preserving Gmsh reconstruction, nonlinear CalculiX execution and automatic field/report generation.</w:t>
-      </w:r>
-    </w:p>
-    <w:p>
-      <w:r>
-        <w:t>Case: identify the Zhangjinggao Bridge catwalk model with 1,125 nodes, 1,194 elements and six dead/construction/wind/temperature combinations.</w:t>
-      </w:r>
-    </w:p>
-    <w:p>
-      <w:r>
-        <w:t>Results: insert 0.859887% maximum displacement difference, 0.853551% bottom-cable span-force difference and 1.125518% portal-cable span-force difference; report matching peak nodes and the calculated safety-factor outcomes.</w:t>
-      </w:r>
-    </w:p>
-    <w:p>
-      <w:r>
-        <w:t>Delivery: close with the reproducible solver evidence, 42 field plots and automatically formatted Word/PDF calculation report.</w:t>
+        <w:t>An executable Skill is developed for nonlinear static verification of the Zhangjinggao Bridge catwalk. The workflow connects versioned finite element inputs, Gmsh mesh reconstruction, CalculiX analysis, cable-force recovery and engineering-report generation. The model contains 1,125 nodes and 1,194 elements and is evaluated under six combinations of dead, construction, wind and temperature loads. Gmsh reproduces the original coordinates and connectivity exactly. Maximum absolute differences from the displacement and cable-force benchmarks are 0.859887%, 0.853551% and 1.125518% for peak displacement, bottom-cable span force and portal-cable span force, respectively. Peak-displacement node identifiers agree in all six cases, and the calculated cable safety factors satisfy the specified requirements. The workflow generates 42 field plots and a Word/PDF calculation report from the shared numerical results.</w:t>
       </w:r>
     </w:p>
     <w:p>
@@ -81,27 +39,17 @@
     </w:p>
     <w:p>
       <w:r>
-        <w:t>Reference anchor: I. Introduction, pp. 1–2</w:t>
+        <w:t>Agentic finite element analysis connects engineering task specifications with geometry processing, mesh generation, numerical solution and result interpretation. FeaGPT organizes these operations into an end-to-end workflow supported by engineering knowledge and computational tools [1]. For bridge catwalk verification, the workflow must carry prestress, support definitions and load history consistently from the input model to the calculation report.</w:t>
       </w:r>
     </w:p>
     <w:p>
       <w:r>
-        <w:t>Paragraph 1 — Introduce agentic engineering workflows through the sequence used in FeaGPT: language-based task specification, tool execution and computational engineering results. Cite FeaGPT at the transition to finite element analysis.</w:t>
+        <w:t>The Zhangjinggao Bridge catwalk provides a six-case application involving permanent loads, construction loads, wind and temperature changes. Its verification requires a common treatment of model identity, nonlinear loading and span-based cable-force assessment.</w:t>
       </w:r>
     </w:p>
     <w:p>
       <w:r>
-        <w:t>Paragraph 2 — Move from the reference aircraft/component setting to bridge catwalk verification. Describe the practical input chain: a prestressed INP model, six load combinations, an existing engineering report and a required reproducible calculation package.</w:t>
-      </w:r>
-    </w:p>
-    <w:p>
-      <w:r>
-        <w:t>Paragraph 3 — Define the central workflow problem: preserving model identity, prestress, stepwise total loads and result-group definitions across automated execution. Use the P5 file-version/load-history episode as the motivating example.</w:t>
-      </w:r>
-    </w:p>
-    <w:p>
-      <w:r>
-        <w:t>Paragraph 4 — Introduce the Skill as the executable analysis specification, then list the paper contributions in the reference order: structured task execution; Gmsh–CalculiX integration; six-case quantitative verification; automatic engineering-report delivery.</w:t>
+        <w:t>This study organizes the analysis through an executable Skill containing the input manifest, material and load definitions, tool sequence, result checks and report specification. The workflow connects Gmsh mesh reconstruction with CalculiX nonlinear analysis and generates displacement fields, cable-force comparisons and an engineering report from a shared result set.</w:t>
       </w:r>
     </w:p>
     <w:p>
@@ -114,17 +62,12 @@
     </w:p>
     <w:p>
       <w:r>
-        <w:t>Reference anchor: II.A. System Overview, p. 3; Fig. 1</w:t>
+        <w:t>The workflow consists of four modules: input and model audit, Gmsh mesh reconstruction, nonlinear CalculiX analysis, and field recovery with report generation. The Skill specifies each module’s inputs, operations and completion criteria. A versioned asset set supplies the six INP files, engineering-report benchmarks and report-format definitions.</w:t>
       </w:r>
     </w:p>
     <w:p>
       <w:r>
-        <w:t>Describe the four workflow modules and their file interfaces using Figure 1. The assistant reads the English Skill and invokes the packaged tools; each tool produces named, machine-readable evidence.</w:t>
-      </w:r>
-    </w:p>
-    <w:p>
-      <w:r>
-        <w:t>Identify the model asset manifest, original PDF, benchmark JSON and font/style assets. Trace one request from asset verification to the report and raw solver package.</w:t>
+        <w:t>Each case produces a solver log and numerical fields. These fields feed the comparison tables, visualization files and Word/PDF report, preserving the connection between calculated values and their source outputs.</w:t>
       </w:r>
     </w:p>
     <w:p>
@@ -137,22 +80,12 @@
     </w:p>
     <w:p>
       <w:r>
-        <w:t>Reference anchor: II.B. Engineering Analysis Planning and Task Orchestration, pp. 3–6; Algorithm 1</w:t>
+        <w:t>The task specification identifies cases P1–P6, the input manifest, solver executable, unit system and required outputs. Execution follows the ordered stages in Algorithm 1. Input hashes and model audits are checked before meshing; mesh identity is checked before solution; final-step field completeness is checked before result recovery.</w:t>
       </w:r>
     </w:p>
     <w:p>
       <w:r>
-        <w:t>Replace the reference geometry-design JSON with the catwalk task schema: input manifest, cases P1–P6, solver identity, units, execution stages, comparison criteria and report outputs.</w:t>
-      </w:r>
-    </w:p>
-    <w:p>
-      <w:r>
-        <w:t>Present Algorithm 1 as the executable order: validate → reconstruct mesh → solve each case → read final fields → recover forces → compare → generate report → hash outputs. State the stage-specific completion conditions.</w:t>
-      </w:r>
-    </w:p>
-    <w:p>
-      <w:r>
-        <w:t>For the planned GLM execution experiment, record provider/model identifier, request, tool calls, elapsed time, retries and final artifact status in a session log. Fill the model identifier from the actual run.</w:t>
+        <w:t>Each case runs in an independent directory. The execution record stores the solver command, return code, elapsed time and warnings, together with the common model audit and final comparison status.</w:t>
       </w:r>
     </w:p>
     <w:p>
@@ -165,22 +98,17 @@
     </w:p>
     <w:p>
       <w:r>
-        <w:t>Reference anchor: II.C. Intelligent Geometry Generation with Knowledge Augmentation, pp. 6–7; Fig. 2</w:t>
+        <w:t>The finite element geometry is reconstructed from the original node coordinates and element connectivity. The model contains bottom catwalk cables, portal support cables and equivalent portal members in the X–Z plane. Original entity identifiers link geometry with sections, supports, loads and reporting groups.</w:t>
       </w:r>
     </w:p>
     <w:p>
       <w:r>
-        <w:t>Describe reconstruction from the original coordinates and connectivity, followed by material/section/support audit. Use Figure 2 to connect global geometry, structural families and a local connection.</w:t>
+        <w:t>The bottom and portal cable materials have an elastic modulus of 120 GPa and equivalent areas of 22298.692 and 8402.9797 mm², respectively. Their assigned densities are 1.26484805e-8 and 8.59881705e-9 tonne/mm³. The equivalent B31 members use an elastic modulus of 206 GPa, a 98.954535 × 98.954535 mm rectangular section and an assigned density of 1.01978381e-17 tonne/mm³.</w:t>
       </w:r>
     </w:p>
     <w:p>
       <w:r>
-        <w:t>Give the equivalent material values from the INP: MAT1/MAT2 E = 120 GPa, areas 22298.692/8402.9797 mm² and their equivalent densities; MAT3 E = 206 GPa, rectangular section 98.954535 × 98.954535 mm and near-zero assigned density.</w:t>
-      </w:r>
-    </w:p>
-    <w:p>
-      <w:r>
-        <w:t>Describe 8,984 initial-stress records across 1,123 cable elements, the global tensor convention and the retained reference geometry. Link numerical values to the material table and asset hashes.</w:t>
+        <w:t>The initial state combines the supplied geometry with 8,984 global initial-stress records at eight integration points of each of the 1,123 cable elements. These records remain associated with their original elements throughout execution.</w:t>
       </w:r>
     </w:p>
     <w:p>
@@ -193,17 +121,12 @@
     </w:p>
     <w:p>
       <w:r>
-        <w:t>Reference anchor: II.D. Adaptive Mesh Generation, pp. 7–8; Fig. 3; Table II</w:t>
+        <w:t>Gmsh constructs points and lines from the input coordinates and connectivity. Each original line receives two mesh nodes through setTransfiniteCurve(eid, 2), followed by first-order one-dimensional mesh generation and MSH 4.1 export. Section sets define the physical groups.</w:t>
       </w:r>
     </w:p>
     <w:p>
       <w:r>
-        <w:t>Explain point/line creation from INP IDs, section physical groups, setTransfiniteCurve(eid, 2), first-order generate(1), and MSH 4.1 export.</w:t>
-      </w:r>
-    </w:p>
-    <w:p>
-      <w:r>
-        <w:t>Distinguish geometric tags from mesh tags. Describe the explicit node/element mapping and checks: node count, element count, coordinates and ordered endpoints. Table II reports the measured mesh identity results.</w:t>
+        <w:t>Explicit mappings connect Gmsh mesh tags to the original node and element identifiers. Verification checks node and element counts, coordinate differences and the ordered endpoints of every line element.</w:t>
       </w:r>
     </w:p>
     <w:p>
@@ -216,22 +139,17 @@
     </w:p>
     <w:p>
       <w:r>
-        <w:t>Reference anchor: II.E. Automated FEA Simulation and Analysis, pp. 8–9</w:t>
+        <w:t>The static solution satisfies R(u, λ) = fint(u, σ0, T) − fext(λ) = 0, accounting for geometric nonlinearity, initial stress and thermal strain. P1 applies dead load in one step. Each of P2–P6 first establishes its own dead-load state, then applies the target total combination in a second step.</w:t>
       </w:r>
     </w:p>
     <w:p>
       <w:r>
-        <w:t>Write equilibrium as R(u, λ) = fint(u, σ0, T) − fext(λ) = 0. Describe geometric nonlinearity, initial prestress, gravity and prescribed supports within the planar X–Z system.</w:t>
+        <w:t>Gravity is 9806 mm/s². The second-step nodal loads include the permanent-load contribution. P5 has a final vertical CLOAD resultant of −6377029.291 N, compared with −4725567.874 N in its first step. P3 and P6 apply temperature changes of −15 and −34°C with a thermal expansion coefficient of 1.2e-5 /°C.</w:t>
       </w:r>
     </w:p>
     <w:p>
       <w:r>
-        <w:t>State the six combinations in Table I. P1 contains one dead-load step; P2–P6 independently establish dead load before their target total combination. Explain the second-step CLOAD total convention, with P5 as the worked example.</w:t>
-      </w:r>
-    </w:p>
-    <w:p>
-      <w:r>
-        <w:t>Give g = 9806 mm/s², alpha = 1.2e-5 /°C for P3/P6, temperature changes −15/−34°C and the 1,125 UY constraints. Identify the locked solver build and final-time checks.</w:t>
+        <w:t>All 1,125 original nodes have UY constrained. The remaining supports follow the input UX and UZ sets. CalculiX 2.23-UCOR6-UCAB3-FT14 solves the six cases using the recorded nonlinear-static controls.</w:t>
       </w:r>
     </w:p>
     <w:p>
@@ -244,22 +162,17 @@
     </w:p>
     <w:p>
       <w:r>
-        <w:t>Reference anchor: II.F. Intelligent Data Analysis and Batch Processing, p. 9</w:t>
+        <w:t>Maximum displacement is evaluated as Umax = max sqrt(UX² + UY² + UZ²) over the original nodes. Cable axial stress is obtained by projecting the mean of the eight integration-point stress tensors onto the deformed element chord. Cable force is recovered as N = A0 nᵀ σbar n / 1000, in kN.</w:t>
       </w:r>
     </w:p>
     <w:p>
       <w:r>
-        <w:t>Define Umax = max sqrt(UX²+UY²+UZ²) over original nodes. Define the deformed chord n and recover N = A0 nᵀ σbar n / 1000 in kN, averaging the eight integration-point tensors.</w:t>
+        <w:t>Four bottom-cable groups and four portal-cable groups define the span maxima. The cable safety factor is K = Nbreak/Nmax, using breaking forces of 38080 and 14280 kN, respectively. Required factors are 3.2 for P1, 2.7 for P2/P3/P4/P6 and 2.5 for P5.</w:t>
       </w:r>
     </w:p>
     <w:p>
       <w:r>
-        <w:t>Define eight reporting span groups, their maxima and K = Nbreak/Nmax. Set Nbreak = 38080/14280 kN and give the case-specific K requirements.</w:t>
-      </w:r>
-    </w:p>
-    <w:p>
-      <w:r>
-        <w:t>Define signed relative difference δ = 100(qcalc/qref − 1). Identify the independent MAPDL displacement source and the report force tables separately. Describe Figure 4 and the machine-readable evidence files.</w:t>
+        <w:t>Signed relative difference is calculated as 100(qcalc/qref − 1). Displacement comparisons use the independent MAPDL results; span-force comparisons use Tables 1-11 and 1-14 of the engineering report.</w:t>
       </w:r>
     </w:p>
     <w:p>
@@ -272,22 +185,12 @@
     </w:p>
     <w:p>
       <w:r>
-        <w:t>Reference anchor: II.G. Scalable Batch Processing Architecture, pp. 9–10</w:t>
+        <w:t>The six cases share a common geometry audit and retain separate input copies, solver outputs and result files. Final displacement and cable-stress fields are exported to CSV and VTU. Seven field plots are generated per case.</w:t>
       </w:r>
     </w:p>
     <w:p>
       <w:r>
-        <w:t>Describe independent case directories, common geometry audit, recorded solver commands, failure preservation and per-stage status.</w:t>
-      </w:r>
-    </w:p>
-    <w:p>
-      <w:r>
-        <w:t>Trace one final response value into CSV, VTU, PNG and the engineering report. Describe the shared result model used for Word/PDF and the style/font assets reproducing the reference report.</w:t>
-      </w:r>
-    </w:p>
-    <w:p>
-      <w:r>
-        <w:t>State the deliverable structure: six solved cases, 42 field plots, comparison data, Gmsh mapping, hashes and a 17-page engineering report in both formats.</w:t>
+        <w:t>A common result object supplies the comparison tables and the Word/PDF calculation report. The report uses the prescribed SimSun, SimHei and Times New Roman fonts, four-span calculation tables and field-plot captions. The resulting package contains 42 plots, both report formats and input/output hashes.</w:t>
       </w:r>
     </w:p>
     <w:p>
@@ -300,17 +203,7 @@
     </w:p>
     <w:p>
       <w:r>
-        <w:t>Reference anchor: III.A. Natural Language Input and System Understanding, p. 11; Table I</w:t>
-      </w:r>
-    </w:p>
-    <w:p>
-      <w:r>
-        <w:t>Present the task request and its mapped case/output specification. Table I enumerates the six combinations and required safety factors.</w:t>
-      </w:r>
-    </w:p>
-    <w:p>
-      <w:r>
-        <w:t>For the GLM session, insert the recorded model ID and stage-completion log. Report execution and retry counts from that log.</w:t>
+        <w:t>Table I lists the six combinations. The case set covers dead load, construction loading, construction wind, maximum gust and two cooling levels. All cases use the same audited geometry, sections, prestress and support definitions.</w:t>
       </w:r>
     </w:p>
     <w:p>
@@ -323,17 +216,7 @@
     </w:p>
     <w:p>
       <w:r>
-        <w:t>Reference anchor: III.B. Geometry Generation Results, pp. 11–12; Fig. 2</w:t>
-      </w:r>
-    </w:p>
-    <w:p>
-      <w:r>
-        <w:t>Report 1,125 original nodes, 1,123 T3D2 cable elements and 71 B31 equivalent members. Show the complete geometry and member assignments in Figure 2.</w:t>
-      </w:r>
-    </w:p>
-    <w:p>
-      <w:r>
-        <w:t>Report the common geometric/physical definitions across cases and the preserved initial-stress record count.</w:t>
+        <w:t>The reconstructed model contains 1,125 nodes and 1,194 elements: 1,123 T3D2 cable elements and 71 B31 equivalent members. The original node identifiers, section assignments and 8,984 initial-stress records are retained across the six cases.</w:t>
       </w:r>
     </w:p>
     <w:p>
@@ -346,17 +229,7 @@
     </w:p>
     <w:p>
       <w:r>
-        <w:t>Reference anchor: III.C. Mesh Generation and Quality Analysis, pp. 12–13; Table II; Fig. 3</w:t>
-      </w:r>
-    </w:p>
-    <w:p>
-      <w:r>
-        <w:t>Report identical node/element counts, zero coordinate discrepancy and matching ordered connectivity between the input and the Gmsh mesh. Use the local inset to display the mapping.</w:t>
-      </w:r>
-    </w:p>
-    <w:p>
-      <w:r>
-        <w:t>Explain how this identity connects solved fields to the displayed geometry and reporting groups.</w:t>
+        <w:t>Gmsh reproduces all 1,125 nodes and 1,194 line elements with zero coordinate discrepancy. The mapped, ordered connectivity agrees for every element. Table II summarizes the identity checks linking the original analysis model with its mesh representation.</w:t>
       </w:r>
     </w:p>
     <w:p>
@@ -369,22 +242,12 @@
     </w:p>
     <w:p>
       <w:r>
-        <w:t>Reference anchor: III.D. FEA Simulation and Results Analysis, p. 14; Table III</w:t>
+        <w:t>All six nonlinear static analyses reach their final states. The peak-displacement node agrees with the MAPDL benchmark in every case. The maximum absolute displacement difference is 0.859887%; maximum absolute span-force differences are 0.853551% for bottom cables and 1.125518% for portal cables.</w:t>
       </w:r>
     </w:p>
     <w:p>
       <w:r>
-        <w:t>Report completion of all six cases and matching peak-displacement node IDs. Present the six numerical rows in Table III.</w:t>
-      </w:r>
-    </w:p>
-    <w:p>
-      <w:r>
-        <w:t>Give maximum absolute differences: displacement 0.859887%, bottom-cable span force 0.853551% and portal-cable span force 1.125518%. Identify the controlling case/span from the supplied evidence table.</w:t>
-      </w:r>
-    </w:p>
-    <w:p>
-      <w:r>
-        <w:t>Discuss P4 as the largest peak-displacement response, P5 peak at node 306, and the P3/P6 cooling responses using the solved fields.</w:t>
+        <w:t>P4 produces the largest displacement, 2846.280 mm at node 1176. P5 reaches 1325.314 mm at node 306. The P3 and P6 cooling combinations produce peak displacements of 1897.223 and 927.260 mm. Table III presents the complete six-case response.</w:t>
       </w:r>
     </w:p>
     <w:p>
@@ -397,22 +260,17 @@
     </w:p>
     <w:p>
       <w:r>
-        <w:t>Reference anchor: III.E. Intelligent Result Analysis and Autonomous Design Evaluation, pp. 14–16; Fig. 4</w:t>
+        <w:t>Figure 4 compares the six peak displacements, 48 span-force pairs, minimum cable safety factors and signed span-force differences. Calculated safety factors exceed the required value in every reported case and span.</w:t>
       </w:r>
     </w:p>
     <w:p>
       <w:r>
-        <w:t>Follow the four panels in order: global displacement agreement, span-force agreement, cable safety factors and the spatial/case distribution of signed differences.</w:t>
+        <w:t>P6 governs the minimum safety factor in both cable families: 2.9464 for the bottom cables and 3.4677 for the portal cables, against a requirement of 2.7. P5 gives minimum factors of 3.1873 and 3.8802, against a requirement of 2.5.</w:t>
       </w:r>
     </w:p>
     <w:p>
       <w:r>
-        <w:t>Compare the governing bottom/portal factors by case with Table I requirements. Use the heatmap to locate differences while retaining cable family and span identity.</w:t>
-      </w:r>
-    </w:p>
-    <w:p>
-      <w:r>
-        <w:t>Explain the load-history correction through the P5 input audit: second-step total nodal load includes the first-step permanent contribution. Connect the input definition with the current node-306 downward response.</w:t>
+        <w:t>The P5 load sequence retains the permanent nodal-load contribution in the second-step total. Its resulting vertical displacement at the peak node is −1325.275 mm. The input audit records the load resultants and their application points alongside this response.</w:t>
       </w:r>
     </w:p>
     <w:p>
@@ -425,22 +283,12 @@
     </w:p>
     <w:p>
       <w:r>
-        <w:t>Reference anchor: III.F. Computational Performance and Scalability, pp. 16–17</w:t>
+        <w:t>The six solver subprocesses complete in a combined wall time of 9.633834 s. Individual times range from 0.768065 s for P1 to 1.870485 s for P4. Table III reports these timings alongside the case responses.</w:t>
       </w:r>
     </w:p>
     <w:p>
       <w:r>
-        <w:t>Report the recorded solver wall times by case and their sum, with Python/platform/solver identity. Label timing boundaries explicitly.</w:t>
-      </w:r>
-    </w:p>
-    <w:p>
-      <w:r>
-        <w:t>Add the planned GLM session measurements in a separate table: planning time, tool time, report-generation time, total session time, token usage when exposed by the provider, retries and completion count.</w:t>
-      </w:r>
-    </w:p>
-    <w:p>
-      <w:r>
-        <w:t>For repeated-session evaluation, use the same six inputs and output contract; record each session independently before calculating completion rate and timing distributions.</w:t>
+        <w:t>The execution record identifies the Python environment, operating system, solver hash and case-specific commands. Input audits, mesh mappings and result summaries accompany the timing data.</w:t>
       </w:r>
     </w:p>
     <w:p>
@@ -453,17 +301,12 @@
     </w:p>
     <w:p>
       <w:r>
-        <w:t>Reference anchor: III.G. Industrial Validation: CalculiX Configuration Generation, pp. 17–18; Fig. 5</w:t>
+        <w:t>The field presentation groups P1, P5 and P6 as representative dead-load, maximum-gust and cooling cases. Vertical displacement and bottom-cable axial force provide the two response fields, with consistent units and scales within each field group.</w:t>
       </w:r>
     </w:p>
     <w:p>
       <w:r>
-        <w:t>Present Figure 5 as the engineering field plate: three representative cases and two response quantities. Compare shared field scales within each row.</w:t>
-      </w:r>
-    </w:p>
-    <w:p>
-      <w:r>
-        <w:t>Show how the prescribed report style is generated from the same result set, and point to the supplementary six-case contour plates, Word/PDF report and raw result archive.</w:t>
+        <w:t>The engineering report presents the calculated four-span forces, reference values, signed differences and safety factors. Its tables and contours derive from the same six-case result set as the machine-readable files.</w:t>
       </w:r>
     </w:p>
     <w:p>
@@ -476,22 +319,17 @@
     </w:p>
     <w:p>
       <w:r>
-        <w:t>Reference anchor: IV. Conclusions, pp. 18–19</w:t>
+        <w:t>The executable Skill integrates versioned input verification, Gmsh mesh reconstruction, nonlinear CalculiX solution, field recovery and engineering-report generation for the bridge catwalk.</w:t>
       </w:r>
     </w:p>
     <w:p>
       <w:r>
-        <w:t>Conclusion 1 — Summarize the Skill-guided sequence connecting versioned bridge inputs to mesh verification, nonlinear solution and engineering-report generation.</w:t>
+        <w:t>The reconstructed mesh retains all original coordinates and connectivity. Across six cases, maximum absolute differences are 0.859887% for peak displacement, 0.853551% for bottom-cable span force and 1.125518% for portal-cable span force. All peak-displacement node identifiers match the benchmarks.</w:t>
       </w:r>
     </w:p>
     <w:p>
       <w:r>
-        <w:t>Conclusion 2 — State the measured mesh identity and six-case response differences with their actual values.</w:t>
-      </w:r>
-    </w:p>
-    <w:p>
-      <w:r>
-        <w:t>Conclusion 3 — State the cable safety-factor outcomes and delivered evidence package. Add session-level GLM findings after inserting the measured session table.</w:t>
+        <w:t>The calculated cable safety factors satisfy the requirements for all reported cases and spans. The workflow produces the six-case numerical evidence, 42 field plots and an automatically formatted Word/PDF calculation report.</w:t>
       </w:r>
     </w:p>
     <w:p>
@@ -2027,221 +1865,6 @@
         <w:pStyle w:val="Heading1"/>
       </w:pPr>
       <w:r>
-        <w:t>Planned GLM session table</w:t>
-      </w:r>
-    </w:p>
-    <w:tbl>
-      <w:tblPr>
-        <w:tblStyle w:val="TableGrid"/>
-        <w:tblW w:type="auto" w:w="0"/>
-        <w:tblLook w:firstColumn="1" w:firstRow="1" w:lastColumn="0" w:lastRow="0" w:noHBand="0" w:noVBand="1" w:val="04A0"/>
-      </w:tblPr>
-      <w:tblGrid>
-        <w:gridCol w:w="5040"/>
-        <w:gridCol w:w="5040"/>
-      </w:tblGrid>
-      <w:tr>
-        <w:tc>
-          <w:tcPr>
-            <w:tcW w:type="dxa" w:w="5040"/>
-          </w:tcPr>
-          <w:p>
-            <w:r>
-              <w:rPr>
-                <w:sz w:val="18"/>
-              </w:rPr>
-              <w:t>Field</w:t>
-            </w:r>
-          </w:p>
-        </w:tc>
-        <w:tc>
-          <w:tcPr>
-            <w:tcW w:type="dxa" w:w="5040"/>
-          </w:tcPr>
-          <w:p>
-            <w:r>
-              <w:rPr>
-                <w:sz w:val="18"/>
-              </w:rPr>
-              <w:t>Value source</w:t>
-            </w:r>
-          </w:p>
-        </w:tc>
-      </w:tr>
-      <w:tr>
-        <w:tc>
-          <w:tcPr>
-            <w:tcW w:type="dxa" w:w="5040"/>
-          </w:tcPr>
-          <w:p>
-            <w:r>
-              <w:rPr>
-                <w:sz w:val="18"/>
-              </w:rPr>
-              <w:t>Provider/model/version</w:t>
-            </w:r>
-          </w:p>
-        </w:tc>
-        <w:tc>
-          <w:tcPr>
-            <w:tcW w:type="dxa" w:w="5040"/>
-          </w:tcPr>
-          <w:p>
-            <w:r>
-              <w:rPr>
-                <w:sz w:val="18"/>
-              </w:rPr>
-              <w:t>Actual GLM session metadata</w:t>
-            </w:r>
-          </w:p>
-        </w:tc>
-      </w:tr>
-      <w:tr>
-        <w:tc>
-          <w:tcPr>
-            <w:tcW w:type="dxa" w:w="5040"/>
-          </w:tcPr>
-          <w:p>
-            <w:r>
-              <w:rPr>
-                <w:sz w:val="18"/>
-              </w:rPr>
-              <w:t>Request and tool trace</w:t>
-            </w:r>
-          </w:p>
-        </w:tc>
-        <w:tc>
-          <w:tcPr>
-            <w:tcW w:type="dxa" w:w="5040"/>
-          </w:tcPr>
-          <w:p>
-            <w:r>
-              <w:rPr>
-                <w:sz w:val="18"/>
-              </w:rPr>
-              <w:t>Saved request and tool-call log</w:t>
-            </w:r>
-          </w:p>
-        </w:tc>
-      </w:tr>
-      <w:tr>
-        <w:tc>
-          <w:tcPr>
-            <w:tcW w:type="dxa" w:w="5040"/>
-          </w:tcPr>
-          <w:p>
-            <w:r>
-              <w:rPr>
-                <w:sz w:val="18"/>
-              </w:rPr>
-              <w:t>Planning / tools / report / total time</w:t>
-            </w:r>
-          </w:p>
-        </w:tc>
-        <w:tc>
-          <w:tcPr>
-            <w:tcW w:type="dxa" w:w="5040"/>
-          </w:tcPr>
-          <w:p>
-            <w:r>
-              <w:rPr>
-                <w:sz w:val="18"/>
-              </w:rPr>
-              <w:t>Session stage timestamps</w:t>
-            </w:r>
-          </w:p>
-        </w:tc>
-      </w:tr>
-      <w:tr>
-        <w:tc>
-          <w:tcPr>
-            <w:tcW w:type="dxa" w:w="5040"/>
-          </w:tcPr>
-          <w:p>
-            <w:r>
-              <w:rPr>
-                <w:sz w:val="18"/>
-              </w:rPr>
-              <w:t>Token usage</w:t>
-            </w:r>
-          </w:p>
-        </w:tc>
-        <w:tc>
-          <w:tcPr>
-            <w:tcW w:type="dxa" w:w="5040"/>
-          </w:tcPr>
-          <w:p>
-            <w:r>
-              <w:rPr>
-                <w:sz w:val="18"/>
-              </w:rPr>
-              <w:t>Provider usage record</w:t>
-            </w:r>
-          </w:p>
-        </w:tc>
-      </w:tr>
-      <w:tr>
-        <w:tc>
-          <w:tcPr>
-            <w:tcW w:type="dxa" w:w="5040"/>
-          </w:tcPr>
-          <w:p>
-            <w:r>
-              <w:rPr>
-                <w:sz w:val="18"/>
-              </w:rPr>
-              <w:t>Retries and completed stages</w:t>
-            </w:r>
-          </w:p>
-        </w:tc>
-        <w:tc>
-          <w:tcPr>
-            <w:tcW w:type="dxa" w:w="5040"/>
-          </w:tcPr>
-          <w:p>
-            <w:r>
-              <w:rPr>
-                <w:sz w:val="18"/>
-              </w:rPr>
-              <w:t>Execution log</w:t>
-            </w:r>
-          </w:p>
-        </w:tc>
-      </w:tr>
-      <w:tr>
-        <w:tc>
-          <w:tcPr>
-            <w:tcW w:type="dxa" w:w="5040"/>
-          </w:tcPr>
-          <w:p>
-            <w:r>
-              <w:rPr>
-                <w:sz w:val="18"/>
-              </w:rPr>
-              <w:t>Repeated-session completion rate</w:t>
-            </w:r>
-          </w:p>
-        </w:tc>
-        <w:tc>
-          <w:tcPr>
-            <w:tcW w:type="dxa" w:w="5040"/>
-          </w:tcPr>
-          <w:p>
-            <w:r>
-              <w:rPr>
-                <w:sz w:val="18"/>
-              </w:rPr>
-              <w:t>Completed sessions / attempted sessions</w:t>
-            </w:r>
-          </w:p>
-        </w:tc>
-      </w:tr>
-    </w:tbl>
-    <w:p>
-      <w:pPr>
-        <w:pStyle w:val="Heading1"/>
-      </w:pPr>
-      <w:r>
         <w:t>Figure list and captions</w:t>
       </w:r>
     </w:p>
@@ -2259,11 +1882,6 @@
       </w:r>
     </w:p>
     <w:p>
-      <w:r>
-        <w:t>Panel construction: Keep the left-to-right request-to-result composition and the knowledge block above the workflow. Replace the aircraft request with the catwalk INP set and reference report. Use four module boxes: input/model audit; Gmsh topology reconstruction; nonlinear CalculiX execution; field recovery and report generation. Add the manifest, Skill and benchmark assets above, and the Word/PDF/CSV/VTU outputs at the return arrow.</w:t>
-      </w:r>
-    </w:p>
-    <w:p>
       <w:pPr>
         <w:pStyle w:val="Heading2"/>
       </w:pPr>
@@ -2274,11 +1892,6 @@
     <w:p>
       <w:r>
         <w:t>Figure 2. Catwalk finite element model: (a) longitudinal profile and control points; (b) cable families and equivalent members; (c) a portal connection with element assignments and boundary conditions.</w:t>
-      </w:r>
-    </w:p>
-    <w:p>
-      <w:r>
-        <w:t>Panel construction: Retain three panels and the global-to-local zoom. Panel (a): full X–Z catwalk profile and control points. Panel (b): bottom cables, portal cables and equivalent members in three colors. Panel (c): enlarged portal/cable connection with original node and element IDs, material assignments and supports. Draw geometry directly from the INP coordinates.</w:t>
       </w:r>
     </w:p>
     <w:p>
@@ -2295,11 +1908,6 @@
       </w:r>
     </w:p>
     <w:p>
-      <w:r>
-        <w:t>Panel construction: Retain the two main panels and inset. Panel (a): original/Gmsh line mesh overlay with an enlarged tag-mapping detail. Annotate 1,125 nodes, 1,194 elements and zero coordinate discrepancy. Panel (b): P5 axial-force line contour using the same geometry; show kN, span group and governing element. Draw only line elements.</w:t>
-      </w:r>
-    </w:p>
-    <w:p>
       <w:pPr>
         <w:pStyle w:val="Heading2"/>
       </w:pPr>
@@ -2310,11 +1918,6 @@
     <w:p>
       <w:r>
         <w:t>Figure 4. Six-case verification: (a) maximum displacement compared with MAPDL; (b) 48 span-force comparisons with the engineering report; (c) minimum span safety factors and required values; (d) signed force differences by case and span.</w:t>
-      </w:r>
-    </w:p>
-    <w:p>
-      <w:r>
-        <w:t>Panel construction: Keep the 2×2 evidence layout. Panel (a): six-case CalculiX/MAPDL peak-displacement bars. Panel (b): parity scatter for 48 report/calculated span-force pairs, distinguished by cable family. Panel (c): minimum four-span safety factor by family and case with required values. Panel (d): signed relative-error heatmap for six cases × eight span groups. Use the actual summary JSON for every point.</w:t>
       </w:r>
     </w:p>
     <w:p>
@@ -2372,11 +1975,6 @@
       </w:r>
     </w:p>
     <w:p>
-      <w:r>
-        <w:t>Panel construction: Keep six panels, arranged as three columns × two rows. Columns: P1 dead load, P5 maximum gust and P6 cooling. Upper row: signed UZ. Lower row: bottom-cable axial force. Use common limits within each field row, label mm/kN, and annotate the relevant extreme node/element. Place all six load cases in supplementary field plates using the same settings.</w:t>
-      </w:r>
-    </w:p>
-    <w:p>
       <w:pPr>
         <w:pStyle w:val="Heading1"/>
       </w:pPr>
@@ -2407,11 +2005,6 @@
     <w:p>
       <w:r>
         <w:t>S5: Generated Word/PDF engineering report and typography specification.</w:t>
-      </w:r>
-    </w:p>
-    <w:p>
-      <w:r>
-        <w:t>S6: GLM session trace and repeated-session measurements, populated from the planned execution experiment.</w:t>
       </w:r>
     </w:p>
     <w:p>

</xml_diff>